<commit_message>
feat(typography): reverse-engineer handcrafted S11 typography and elevate dual-layer deep audit invariants
</commit_message>
<xml_diff>
--- a/算法训练材料/PA-3223/PA-3223 msds_CN 冠志.docx
+++ b/算法训练材料/PA-3223/PA-3223 msds_CN 冠志.docx
@@ -123,9 +123,6 @@
                 <w:ilvl w:val="1"/>
                 <w:numId w:val="0"/>
               </w:numPr>
-              <w:tabs>
-                <w:tab w:val="left" w:pos="459"/>
-              </w:tabs>
               <w:kinsoku/>
               <w:wordWrap/>
               <w:overflowPunct/>
@@ -259,9 +256,6 @@
               <w:keepLines w:val="0"/>
               <w:pageBreakBefore w:val="0"/>
               <w:widowControl w:val="0"/>
-              <w:tabs>
-                <w:tab w:val="left" w:pos="459"/>
-              </w:tabs>
               <w:kinsoku/>
               <w:wordWrap/>
               <w:overflowPunct/>
@@ -374,9 +368,6 @@
               <w:keepLines w:val="0"/>
               <w:pageBreakBefore w:val="0"/>
               <w:widowControl w:val="0"/>
-              <w:tabs>
-                <w:tab w:val="left" w:pos="459"/>
-              </w:tabs>
               <w:kinsoku/>
               <w:wordWrap/>
               <w:overflowPunct/>
@@ -493,10 +484,6 @@
                 <w:ilvl w:val="1"/>
                 <w:numId w:val="0"/>
               </w:numPr>
-              <w:tabs>
-                <w:tab w:val="left" w:pos="0"/>
-                <w:tab w:val="left" w:pos="459"/>
-              </w:tabs>
               <w:kinsoku/>
               <w:wordWrap/>
               <w:overflowPunct/>
@@ -643,9 +630,6 @@
                 <w:ilvl w:val="1"/>
                 <w:numId w:val="0"/>
               </w:numPr>
-              <w:tabs>
-                <w:tab w:val="left" w:pos="459"/>
-              </w:tabs>
               <w:kinsoku/>
               <w:wordWrap/>
               <w:overflowPunct/>
@@ -769,9 +753,6 @@
               <w:keepLines w:val="0"/>
               <w:pageBreakBefore w:val="0"/>
               <w:widowControl w:val="0"/>
-              <w:tabs>
-                <w:tab w:val="left" w:pos="459"/>
-              </w:tabs>
               <w:kinsoku/>
               <w:wordWrap/>
               <w:overflowPunct/>
@@ -885,9 +866,6 @@
               <w:keepLines w:val="0"/>
               <w:pageBreakBefore w:val="0"/>
               <w:widowControl w:val="0"/>
-              <w:tabs>
-                <w:tab w:val="left" w:pos="459"/>
-              </w:tabs>
               <w:kinsoku/>
               <w:wordWrap/>
               <w:overflowPunct/>
@@ -998,9 +976,6 @@
               <w:keepLines w:val="0"/>
               <w:pageBreakBefore w:val="0"/>
               <w:widowControl w:val="0"/>
-              <w:tabs>
-                <w:tab w:val="left" w:pos="459"/>
-              </w:tabs>
               <w:kinsoku/>
               <w:wordWrap/>
               <w:overflowPunct/>
@@ -1112,9 +1087,6 @@
               <w:keepLines w:val="0"/>
               <w:pageBreakBefore w:val="0"/>
               <w:widowControl w:val="0"/>
-              <w:tabs>
-                <w:tab w:val="left" w:pos="459"/>
-              </w:tabs>
               <w:kinsoku/>
               <w:wordWrap/>
               <w:overflowPunct/>
@@ -1298,322 +1270,282 @@
         <w:tc>
           <w:tcPr>
             <w:tcW w:w="9795" w:type="dxa"/>
+            <w:gridSpan w:val="2"/>
+            <w:vAlign w:val="center"/>
             <w:tcBorders>
               <w:top w:val="dotted" w:color="auto" w:sz="4" w:space="0"/>
               <w:bottom w:val="dotted" w:color="auto" w:sz="4" w:space="0"/>
               <w:right w:val="dotted" w:color="auto" w:sz="4" w:space="0"/>
             </w:tcBorders>
-            <w:vAlign w:val="center"/>
-            <w:gridSpan w:val="2"/>
-          </w:tcPr>
-          <w:p>
-            <w:pPr>
-              <w:jc w:val="left"/>
-              <w:spacing w:line="300" w:lineRule="auto"/>
-            </w:pPr>
-            <w:r>
-              <w:rPr>
-                <w:rFonts w:ascii="SimSun" w:eastAsia="SimSun" w:hAnsi="SimSun"/>
-                <w:sz w:val="18"/>
-              </w:rPr>
-              <w:t xml:space="preserve">GHS危险性类别: 无</w:t>
-            </w:r>
-          </w:p>
-          <w:p>
-            <w:pPr>
-              <w:jc w:val="left"/>
-              <w:spacing w:line="300" w:lineRule="auto"/>
-            </w:pPr>
-            <w:r>
-              <w:rPr>
-                <w:rFonts w:ascii="SimSun" w:eastAsia="SimSun" w:hAnsi="SimSun"/>
-                <w:sz w:val="18"/>
-              </w:rPr>
-              <w:t xml:space="preserve">羟基丙烯酸酯聚合物</w:t>
-            </w:r>
-          </w:p>
-          <w:p>
-            <w:pPr>
-              <w:jc w:val="left"/>
-              <w:spacing w:line="300" w:lineRule="auto"/>
-            </w:pPr>
-            <w:r>
-              <w:rPr>
-                <w:rFonts w:ascii="SimSun" w:eastAsia="SimSun" w:hAnsi="SimSun"/>
-                <w:sz w:val="18"/>
-              </w:rPr>
-              <w:t xml:space="preserve">水</w:t>
-            </w:r>
-          </w:p>
-          <w:p>
-            <w:pPr>
-              <w:jc w:val="left"/>
-              <w:spacing w:line="300" w:lineRule="auto"/>
-            </w:pPr>
-            <w:r>
-              <w:rPr>
-                <w:rFonts w:ascii="SimSun" w:eastAsia="SimSun" w:hAnsi="SimSun"/>
-                <w:sz w:val="18"/>
-              </w:rPr>
-              <w:t xml:space="preserve">丙二醇丁醚</w:t>
-            </w:r>
-          </w:p>
-          <w:p>
-            <w:pPr>
-              <w:jc w:val="left"/>
-              <w:spacing w:line="300" w:lineRule="auto"/>
-            </w:pPr>
-            <w:r>
-              <w:rPr>
-                <w:rFonts w:ascii="SimSun" w:eastAsia="SimSun" w:hAnsi="SimSun"/>
-                <w:sz w:val="18"/>
-              </w:rPr>
-              <w:t xml:space="preserve">N,N二甲基乙醇胺</w:t>
-            </w:r>
-          </w:p>
-          <w:p>
-            <w:pPr>
-              <w:jc w:val="left"/>
-              <w:spacing w:line="300" w:lineRule="auto"/>
-            </w:pPr>
-            <w:r>
-              <w:rPr>
-                <w:rFonts w:ascii="SimSun" w:eastAsia="SimSun" w:hAnsi="SimSun"/>
-                <w:sz w:val="18"/>
-              </w:rPr>
-              <w:t xml:space="preserve">商业机密</w:t>
-            </w:r>
-          </w:p>
-          <w:p>
-            <w:pPr>
-              <w:jc w:val="left"/>
-              <w:spacing w:line="300" w:lineRule="auto"/>
-            </w:pPr>
-            <w:r>
-              <w:rPr>
-                <w:rFonts w:ascii="SimSun" w:eastAsia="SimSun" w:hAnsi="SimSun"/>
-                <w:sz w:val="18"/>
-              </w:rPr>
-              <w:t xml:space="preserve">7732-18-5</w:t>
-            </w:r>
-          </w:p>
-          <w:p>
-            <w:pPr>
-              <w:jc w:val="left"/>
-              <w:spacing w:line="300" w:lineRule="auto"/>
-            </w:pPr>
-            <w:r>
-              <w:rPr>
-                <w:rFonts w:ascii="SimSun" w:eastAsia="SimSun" w:hAnsi="SimSun"/>
-                <w:sz w:val="18"/>
-              </w:rPr>
-              <w:t xml:space="preserve">5131-66-8</w:t>
-            </w:r>
-          </w:p>
-          <w:p>
-            <w:pPr>
-              <w:jc w:val="left"/>
-              <w:spacing w:line="300" w:lineRule="auto"/>
-            </w:pPr>
-            <w:r>
-              <w:rPr>
-                <w:rFonts w:ascii="SimSun" w:eastAsia="SimSun" w:hAnsi="SimSun"/>
-                <w:sz w:val="18"/>
-              </w:rPr>
-              <w:t xml:space="preserve">108-01-0</w:t>
-            </w:r>
-          </w:p>
-          <w:p>
-            <w:pPr>
-              <w:jc w:val="left"/>
-              <w:spacing w:line="300" w:lineRule="auto"/>
-            </w:pPr>
-            <w:r>
-              <w:rPr>
-                <w:rFonts w:ascii="SimSun" w:eastAsia="SimSun" w:hAnsi="SimSun"/>
-                <w:sz w:val="18"/>
-              </w:rPr>
-              <w:t xml:space="preserve">46±5</w:t>
-            </w:r>
-          </w:p>
-          <w:p>
-            <w:pPr>
-              <w:jc w:val="left"/>
-              <w:spacing w:line="300" w:lineRule="auto"/>
-            </w:pPr>
-            <w:r>
-              <w:rPr>
-                <w:rFonts w:ascii="SimSun" w:eastAsia="SimSun" w:hAnsi="SimSun"/>
-                <w:sz w:val="18"/>
-              </w:rPr>
-              <w:t xml:space="preserve">45.5±5</w:t>
-            </w:r>
-          </w:p>
-          <w:p>
-            <w:pPr>
-              <w:jc w:val="left"/>
-              <w:spacing w:line="300" w:lineRule="auto"/>
-            </w:pPr>
-            <w:r>
-              <w:rPr>
-                <w:rFonts w:ascii="SimSun" w:eastAsia="SimSun" w:hAnsi="SimSun"/>
-                <w:sz w:val="18"/>
-              </w:rPr>
-              <w:t xml:space="preserve">7±3</w:t>
-            </w:r>
-          </w:p>
-          <w:p>
-            <w:pPr>
-              <w:jc w:val="left"/>
-              <w:spacing w:line="300" w:lineRule="auto"/>
-            </w:pPr>
-            <w:r>
-              <w:rPr>
-                <w:rFonts w:ascii="SimSun" w:eastAsia="SimSun" w:hAnsi="SimSun"/>
-                <w:sz w:val="18"/>
-              </w:rPr>
-              <w:t xml:space="preserve">1.5±0.5</w:t>
-            </w:r>
-          </w:p>
-          <w:p>
-            <w:pPr>
-              <w:jc w:val="left"/>
-              <w:spacing w:line="300" w:lineRule="auto"/>
-            </w:pPr>
-            <w:r>
-              <w:rPr>
-                <w:rFonts w:ascii="SimSun" w:eastAsia="SimSun" w:hAnsi="SimSun"/>
-                <w:sz w:val="18"/>
-              </w:rPr>
-              <w:t xml:space="preserve">羟基丙烯酸酯聚合物GHS危险性分类：不适用</w:t>
-            </w:r>
-          </w:p>
-          <w:p>
-            <w:pPr>
-              <w:jc w:val="left"/>
-              <w:spacing w:line="300" w:lineRule="auto"/>
-            </w:pPr>
-            <w:r>
-              <w:rPr>
-                <w:rFonts w:ascii="SimSun" w:eastAsia="SimSun" w:hAnsi="SimSun"/>
-                <w:sz w:val="18"/>
+          </w:tcPr>
+          <w:p>
+            <w:pPr>
+              <w:jc w:val="left"/>
+              <w:spacing w:line="300" w:lineRule="auto"/>
+            </w:pPr>
+            <w:r>
+              <w:rPr>
+                <w:rFonts w:hint="eastAsia" w:ascii="Times New Roman" w:hAnsi="Times New Roman" w:eastAsia="宋体"/>
+                <w:sz w:val="24"/>
+                <w:b/>
+              </w:rPr>
+              <w:t xml:space="preserve">GHS危险性类别:</w:t>
+            </w:r>
+            <w:r>
+              <w:rPr>
+                <w:rFonts w:hint="eastAsia" w:ascii="Times New Roman" w:hAnsi="Times New Roman" w:eastAsia="宋体"/>
+                <w:sz w:val="24"/>
+              </w:rPr>
+              <w:t xml:space="preserve"> </w:t>
+            </w:r>
+            <w:r>
+              <w:rPr>
+                <w:rFonts w:hint="eastAsia" w:ascii="Times New Roman" w:hAnsi="Times New Roman" w:eastAsia="宋体"/>
+                <w:sz w:val="24"/>
+              </w:rPr>
+              <w:t xml:space="preserve">无</w:t>
+            </w:r>
+          </w:p>
+          <w:p>
+            <w:pPr>
+              <w:jc w:val="left"/>
+              <w:spacing w:line="300" w:lineRule="auto"/>
+            </w:pPr>
+            <w:r>
+              <w:rPr>
+                <w:rFonts w:hint="eastAsia" w:ascii="Times New Roman" w:hAnsi="Times New Roman" w:eastAsia="宋体"/>
+                <w:sz w:val="24"/>
+                <w:b/>
+              </w:rPr>
+              <w:t xml:space="preserve">羟基丙烯酸酯聚合物GHS危险性分类：</w:t>
+            </w:r>
+            <w:r>
+              <w:rPr>
+                <w:rFonts w:hint="eastAsia" w:ascii="Times New Roman" w:hAnsi="Times New Roman" w:eastAsia="宋体"/>
+                <w:sz w:val="24"/>
+              </w:rPr>
+              <w:t xml:space="preserve">不适用；</w:t>
+            </w:r>
+          </w:p>
+          <w:p>
+            <w:pPr>
+              <w:spacing w:line="300" w:lineRule="auto"/>
+            </w:pPr>
+            <w:r>
+              <w:rPr>
+                <w:rFonts w:hint="eastAsia" w:ascii="Times New Roman" w:hAnsi="Times New Roman" w:eastAsia="宋体"/>
+                <w:sz w:val="24"/>
+                <w:b/>
+              </w:rPr>
+              <w:t xml:space="preserve">标签要素</w:t>
+            </w:r>
+            <w:r>
+              <w:rPr>
+                <w:rFonts w:hint="eastAsia" w:ascii="Times New Roman" w:hAnsi="Times New Roman" w:eastAsia="宋体"/>
+                <w:sz w:val="24"/>
+              </w:rPr>
+              <w:t xml:space="preserve">：</w:t>
+            </w:r>
+          </w:p>
+          <w:p>
+            <w:pPr>
+              <w:spacing w:line="300" w:lineRule="auto"/>
+              <w:ind w:firstLine="480" w:right="480"/>
+            </w:pPr>
+            <w:r>
+              <w:rPr>
+                <w:rFonts w:hint="eastAsia" w:ascii="Times New Roman" w:hAnsi="Times New Roman" w:eastAsia="宋体"/>
+                <w:sz w:val="24"/>
               </w:rPr>
               <w:t xml:space="preserve">请注意以下物质：</w:t>
             </w:r>
           </w:p>
           <w:p>
             <w:pPr>
-              <w:jc w:val="left"/>
-              <w:spacing w:line="300" w:lineRule="auto"/>
-            </w:pPr>
-            <w:r>
-              <w:rPr>
-                <w:rFonts w:ascii="SimSun" w:eastAsia="SimSun" w:hAnsi="SimSun"/>
-                <w:sz w:val="18"/>
-              </w:rPr>
-              <w:t xml:space="preserve">N,N-二甲基乙醇胺，中和剂，已键合为盐，质量浓度小于2.0%</w:t>
-            </w:r>
-          </w:p>
-          <w:p>
-            <w:pPr>
-              <w:jc w:val="left"/>
-              <w:spacing w:line="300" w:lineRule="auto"/>
-            </w:pPr>
-            <w:r>
-              <w:rPr>
-                <w:rFonts w:ascii="SimSun" w:eastAsia="SimSun" w:hAnsi="SimSun"/>
-                <w:sz w:val="18"/>
-              </w:rPr>
-              <w:t xml:space="preserve">GHS分类：依然液体3 H226；急性毒性4 吸入性 H332；急性毒性4 经皮H312；皮肤腐蚀1B H314；特异性靶器官系统毒性（一次接触）3 H335</w:t>
-            </w:r>
-          </w:p>
-          <w:p>
-            <w:pPr>
-              <w:jc w:val="left"/>
-              <w:spacing w:line="300" w:lineRule="auto"/>
-            </w:pPr>
-            <w:r>
-              <w:rPr>
-                <w:rFonts w:ascii="SimSun" w:eastAsia="SimSun" w:hAnsi="SimSun"/>
-                <w:sz w:val="18"/>
-              </w:rPr>
-              <w:t xml:space="preserve">特定阈值浓度≥5%</w:t>
-            </w:r>
-          </w:p>
-          <w:p>
-            <w:pPr>
-              <w:jc w:val="left"/>
-              <w:spacing w:line="300" w:lineRule="auto"/>
-            </w:pPr>
-            <w:r>
-              <w:rPr>
-                <w:rFonts w:ascii="SimSun" w:eastAsia="SimSun" w:hAnsi="SimSun"/>
-                <w:sz w:val="18"/>
-              </w:rPr>
-              <w:t xml:space="preserve">特异性靶器官系统毒性（一次接触）3 H335</w:t>
-            </w:r>
-          </w:p>
-          <w:p>
-            <w:pPr>
-              <w:jc w:val="left"/>
-              <w:spacing w:line="300" w:lineRule="auto"/>
-            </w:pPr>
-            <w:r>
-              <w:rPr>
-                <w:rFonts w:ascii="SimSun" w:eastAsia="SimSun" w:hAnsi="SimSun"/>
-                <w:sz w:val="18"/>
-              </w:rPr>
-              <w:t xml:space="preserve">象形图：无</w:t>
-            </w:r>
-          </w:p>
-          <w:p>
-            <w:pPr>
-              <w:jc w:val="left"/>
-              <w:spacing w:line="300" w:lineRule="auto"/>
-            </w:pPr>
-            <w:r>
-              <w:rPr>
-                <w:rFonts w:ascii="SimSun" w:eastAsia="SimSun" w:hAnsi="SimSun"/>
-                <w:sz w:val="18"/>
-              </w:rPr>
-              <w:t xml:space="preserve">警告词：警告</w:t>
-            </w:r>
-          </w:p>
-          <w:p>
-            <w:pPr>
-              <w:jc w:val="left"/>
-              <w:spacing w:line="300" w:lineRule="auto"/>
-            </w:pPr>
-            <w:r>
-              <w:rPr>
-                <w:rFonts w:ascii="SimSun" w:eastAsia="SimSun" w:hAnsi="SimSun"/>
-                <w:sz w:val="18"/>
-              </w:rPr>
-              <w:t xml:space="preserve">危害性说明:没有明显的已知作用或严重危险。</w:t>
-            </w:r>
-          </w:p>
-          <w:p>
-            <w:pPr>
-              <w:jc w:val="left"/>
-              <w:spacing w:line="300" w:lineRule="auto"/>
-            </w:pPr>
-            <w:r>
-              <w:rPr>
-                <w:rFonts w:ascii="SimSun" w:eastAsia="SimSun" w:hAnsi="SimSun"/>
-                <w:sz w:val="18"/>
+              <w:spacing w:line="300" w:lineRule="auto"/>
+              <w:ind w:firstLine="480" w:right="480"/>
+            </w:pPr>
+            <w:r>
+              <w:rPr>
+                <w:rFonts w:hint="eastAsia" w:ascii="Times New Roman" w:hAnsi="Times New Roman" w:eastAsia="宋体"/>
+                <w:sz w:val="24"/>
+              </w:rPr>
+              <w:t xml:space="preserve">N,N-二甲基乙醇胺，中和剂，已键合为盐，质量浓度小于2.0%，特定阈值浓度≥5%</w:t>
+            </w:r>
+          </w:p>
+          <w:p>
+            <w:pPr>
+              <w:spacing w:line="300" w:lineRule="auto"/>
+              <w:ind w:firstLine="480" w:right="480"/>
+            </w:pPr>
+            <w:r>
+              <w:rPr>
+                <w:rFonts w:hint="eastAsia" w:ascii="Times New Roman" w:hAnsi="Times New Roman" w:eastAsia="宋体"/>
+                <w:sz w:val="24"/>
+              </w:rPr>
+              <w:t xml:space="preserve">GHS分类：</w:t>
+            </w:r>
+          </w:p>
+          <w:p>
+            <w:pPr>
+              <w:spacing w:line="300" w:lineRule="auto"/>
+              <w:ind w:firstLine="480" w:right="480"/>
+            </w:pPr>
+            <w:r>
+              <w:rPr>
+                <w:rFonts w:hint="eastAsia" w:ascii="Times New Roman" w:hAnsi="Times New Roman" w:eastAsia="宋体"/>
+                <w:sz w:val="24"/>
+              </w:rPr>
+              <w:t xml:space="preserve">易燃液体3 H226；</w:t>
+            </w:r>
+          </w:p>
+          <w:p>
+            <w:pPr>
+              <w:spacing w:line="300" w:lineRule="auto"/>
+              <w:ind w:firstLine="480" w:right="480"/>
+            </w:pPr>
+            <w:r>
+              <w:rPr>
+                <w:rFonts w:hint="eastAsia" w:ascii="Times New Roman" w:hAnsi="Times New Roman" w:eastAsia="宋体"/>
+                <w:sz w:val="24"/>
+              </w:rPr>
+              <w:t xml:space="preserve">急性毒性4 吸入性 H332；</w:t>
+            </w:r>
+          </w:p>
+          <w:p>
+            <w:pPr>
+              <w:spacing w:line="300" w:lineRule="auto"/>
+              <w:ind w:firstLine="480" w:right="480"/>
+            </w:pPr>
+            <w:r>
+              <w:rPr>
+                <w:rFonts w:hint="eastAsia" w:ascii="Times New Roman" w:hAnsi="Times New Roman" w:eastAsia="宋体"/>
+                <w:sz w:val="24"/>
+              </w:rPr>
+              <w:t xml:space="preserve">急性毒性4 经皮H312；</w:t>
+            </w:r>
+          </w:p>
+          <w:p>
+            <w:pPr>
+              <w:spacing w:line="300" w:lineRule="auto"/>
+              <w:ind w:firstLine="480" w:right="480"/>
+            </w:pPr>
+            <w:r>
+              <w:rPr>
+                <w:rFonts w:hint="eastAsia" w:ascii="Times New Roman" w:hAnsi="Times New Roman" w:eastAsia="宋体"/>
+                <w:sz w:val="24"/>
+              </w:rPr>
+              <w:t xml:space="preserve">皮肤腐蚀1B H314；</w:t>
+            </w:r>
+          </w:p>
+          <w:p>
+            <w:pPr>
+              <w:spacing w:line="300" w:lineRule="auto"/>
+              <w:ind w:firstLine="480" w:right="480"/>
+            </w:pPr>
+            <w:r>
+              <w:rPr>
+                <w:rFonts w:hint="eastAsia" w:ascii="Times New Roman" w:hAnsi="Times New Roman" w:eastAsia="宋体"/>
+                <w:sz w:val="24"/>
+              </w:rPr>
+              <w:t xml:space="preserve">特异性靶器官系统毒性（一次接触）3 H335；</w:t>
+            </w:r>
+          </w:p>
+          <w:p>
+            <w:pPr>
+              <w:spacing w:line="300" w:lineRule="auto"/>
+              <w:ind w:firstLine="480" w:right="480"/>
+            </w:pPr>
+            <w:r>
+              <w:rPr>
+                <w:rFonts w:hint="eastAsia" w:ascii="Times New Roman" w:hAnsi="Times New Roman" w:eastAsia="宋体"/>
+                <w:sz w:val="24"/>
+              </w:rPr>
+              <w:t xml:space="preserve">特异性靶器官系统毒性（一次接触）3 H335；</w:t>
+            </w:r>
+          </w:p>
+          <w:p>
+            <w:pPr>
+              <w:spacing w:line="300" w:lineRule="auto"/>
+            </w:pPr>
+            <w:r>
+              <w:rPr>
+                <w:rFonts w:hint="eastAsia" w:ascii="Times New Roman" w:hAnsi="Times New Roman" w:eastAsia="宋体"/>
+                <w:sz w:val="24"/>
+                <w:b/>
+              </w:rPr>
+              <w:t xml:space="preserve">象形图：</w:t>
+            </w:r>
+            <w:r>
+              <w:rPr>
+                <w:rFonts w:hint="eastAsia" w:ascii="Times New Roman" w:hAnsi="Times New Roman" w:eastAsia="宋体"/>
+                <w:sz w:val="24"/>
+              </w:rPr>
+              <w:t xml:space="preserve">无</w:t>
+            </w:r>
+          </w:p>
+          <w:p>
+            <w:pPr>
+              <w:spacing w:line="300" w:lineRule="auto"/>
+            </w:pPr>
+            <w:r>
+              <w:rPr>
+                <w:rFonts w:hint="eastAsia" w:ascii="Times New Roman" w:hAnsi="Times New Roman" w:eastAsia="宋体"/>
+                <w:sz w:val="24"/>
+                <w:b/>
+              </w:rPr>
+              <w:t xml:space="preserve">警告词：</w:t>
+            </w:r>
+            <w:r>
+              <w:rPr>
+                <w:rFonts w:hint="eastAsia" w:ascii="Times New Roman" w:hAnsi="Times New Roman" w:eastAsia="宋体"/>
+                <w:sz w:val="24"/>
+              </w:rPr>
+              <w:t xml:space="preserve">警告</w:t>
+            </w:r>
+          </w:p>
+          <w:p>
+            <w:pPr>
+              <w:spacing w:line="300" w:lineRule="auto"/>
+            </w:pPr>
+            <w:r>
+              <w:rPr>
+                <w:rFonts w:hint="eastAsia" w:ascii="Times New Roman" w:hAnsi="Times New Roman" w:eastAsia="宋体"/>
+                <w:sz w:val="24"/>
+                <w:b/>
+              </w:rPr>
+              <w:t xml:space="preserve">危害性说明:</w:t>
+            </w:r>
+            <w:r>
+              <w:rPr>
+                <w:rFonts w:hint="eastAsia" w:ascii="Times New Roman" w:hAnsi="Times New Roman" w:eastAsia="宋体"/>
+                <w:sz w:val="24"/>
+              </w:rPr>
+              <w:t xml:space="preserve">没有明显的已知作用或严重危险。</w:t>
+            </w:r>
+          </w:p>
+          <w:p>
+            <w:pPr>
+              <w:spacing w:line="300" w:lineRule="auto"/>
+            </w:pPr>
+            <w:r>
+              <w:rPr>
+                <w:rFonts w:hint="eastAsia" w:ascii="Times New Roman" w:hAnsi="Times New Roman" w:eastAsia="宋体"/>
+                <w:sz w:val="24"/>
+                <w:b/>
               </w:rPr>
               <w:t xml:space="preserve">防范说明:</w:t>
             </w:r>
           </w:p>
           <w:p>
             <w:pPr>
-              <w:jc w:val="left"/>
-              <w:spacing w:line="300" w:lineRule="auto"/>
-            </w:pPr>
-            <w:r>
-              <w:rPr>
-                <w:rFonts w:ascii="SimSun" w:eastAsia="SimSun" w:hAnsi="SimSun"/>
-                <w:sz w:val="18"/>
+              <w:spacing w:line="300" w:lineRule="auto"/>
+              <w:ind w:firstLine="482"/>
+            </w:pPr>
+            <w:r>
+              <w:rPr>
+                <w:rFonts w:hint="eastAsia" w:ascii="Times New Roman" w:hAnsi="Times New Roman" w:eastAsia="宋体"/>
+                <w:sz w:val="24"/>
                 <w:b/>
               </w:rPr>
               <w:t xml:space="preserve">预防措施：</w:t>
@@ -1621,65 +1553,104 @@
           </w:p>
           <w:p>
             <w:pPr>
-              <w:jc w:val="left"/>
-              <w:spacing w:line="300" w:lineRule="auto"/>
-            </w:pPr>
-            <w:r>
-              <w:rPr>
-                <w:rFonts w:ascii="SimSun" w:eastAsia="SimSun" w:hAnsi="SimSun"/>
-                <w:sz w:val="18"/>
+              <w:spacing w:line="300" w:lineRule="auto"/>
+            </w:pPr>
+            <w:r>
+              <w:rPr>
+                <w:rFonts w:hint="eastAsia" w:ascii="Times New Roman" w:hAnsi="Times New Roman" w:eastAsia="宋体"/>
+                <w:sz w:val="24"/>
+              </w:rPr>
+              <w:t xml:space="preserve"> </w:t>
+            </w:r>
+            <w:r>
+              <w:rPr>
+                <w:rFonts w:hint="eastAsia" w:ascii="Times New Roman" w:hAnsi="Times New Roman" w:eastAsia="宋体"/>
+                <w:sz w:val="24"/>
+              </w:rPr>
+              <w:t xml:space="preserve">       </w:t>
+            </w:r>
+            <w:r>
+              <w:rPr>
+                <w:rFonts w:hint="eastAsia" w:ascii="Times New Roman" w:hAnsi="Times New Roman" w:eastAsia="宋体"/>
+                <w:sz w:val="24"/>
               </w:rPr>
               <w:t xml:space="preserve">操作时穿戴必要的防护用品（手套、防护镜、工作服等）。</w:t>
             </w:r>
           </w:p>
           <w:p>
             <w:pPr>
-              <w:jc w:val="left"/>
-              <w:spacing w:line="300" w:lineRule="auto"/>
-            </w:pPr>
-            <w:r>
-              <w:rPr>
-                <w:rFonts w:ascii="SimSun" w:eastAsia="SimSun" w:hAnsi="SimSun"/>
-                <w:sz w:val="18"/>
+              <w:spacing w:line="300" w:lineRule="auto"/>
+            </w:pPr>
+            <w:r>
+              <w:rPr>
+                <w:rFonts w:hint="eastAsia" w:ascii="Times New Roman" w:hAnsi="Times New Roman" w:eastAsia="宋体"/>
+                <w:sz w:val="24"/>
+              </w:rPr>
+              <w:t xml:space="preserve"> </w:t>
+            </w:r>
+            <w:r>
+              <w:rPr>
+                <w:rFonts w:hint="eastAsia" w:ascii="Times New Roman" w:hAnsi="Times New Roman" w:eastAsia="宋体"/>
+                <w:sz w:val="24"/>
+              </w:rPr>
+              <w:t xml:space="preserve">       </w:t>
+            </w:r>
+            <w:r>
+              <w:rPr>
+                <w:rFonts w:hint="eastAsia" w:ascii="Times New Roman" w:hAnsi="Times New Roman" w:eastAsia="宋体"/>
+                <w:sz w:val="24"/>
               </w:rPr>
               <w:t xml:space="preserve">操作后彻底清洗身体接触部位。</w:t>
             </w:r>
           </w:p>
           <w:p>
             <w:pPr>
-              <w:jc w:val="left"/>
-              <w:spacing w:line="300" w:lineRule="auto"/>
-            </w:pPr>
-            <w:r>
-              <w:rPr>
-                <w:rFonts w:ascii="SimSun" w:eastAsia="SimSun" w:hAnsi="SimSun"/>
-                <w:sz w:val="18"/>
+              <w:spacing w:line="300" w:lineRule="auto"/>
+            </w:pPr>
+            <w:r>
+              <w:rPr>
+                <w:rFonts w:hint="eastAsia" w:ascii="Times New Roman" w:hAnsi="Times New Roman" w:eastAsia="宋体"/>
+                <w:sz w:val="24"/>
+              </w:rPr>
+              <w:t xml:space="preserve"> </w:t>
+            </w:r>
+            <w:r>
+              <w:rPr>
+                <w:rFonts w:hint="eastAsia" w:ascii="Times New Roman" w:hAnsi="Times New Roman" w:eastAsia="宋体"/>
+                <w:sz w:val="24"/>
+              </w:rPr>
+              <w:t xml:space="preserve">       </w:t>
+            </w:r>
+            <w:r>
+              <w:rPr>
+                <w:rFonts w:hint="eastAsia" w:ascii="Times New Roman" w:hAnsi="Times New Roman" w:eastAsia="宋体"/>
+                <w:sz w:val="24"/>
               </w:rPr>
               <w:t xml:space="preserve">作业场所不得进食，饮水或吸烟。</w:t>
             </w:r>
           </w:p>
           <w:p>
             <w:pPr>
-              <w:jc w:val="left"/>
-              <w:spacing w:line="300" w:lineRule="auto"/>
-            </w:pPr>
-            <w:r>
-              <w:rPr>
-                <w:rFonts w:ascii="SimSun" w:eastAsia="SimSun" w:hAnsi="SimSun"/>
-                <w:sz w:val="18"/>
+              <w:spacing w:line="300" w:lineRule="auto"/>
+              <w:ind w:firstLine="960"/>
+            </w:pPr>
+            <w:r>
+              <w:rPr>
+                <w:rFonts w:hint="eastAsia" w:ascii="Times New Roman" w:hAnsi="Times New Roman" w:eastAsia="宋体"/>
+                <w:sz w:val="24"/>
               </w:rPr>
               <w:t xml:space="preserve">在室外或通风良好处操作。</w:t>
             </w:r>
           </w:p>
           <w:p>
             <w:pPr>
-              <w:jc w:val="left"/>
-              <w:spacing w:line="300" w:lineRule="auto"/>
-            </w:pPr>
-            <w:r>
-              <w:rPr>
-                <w:rFonts w:ascii="SimSun" w:eastAsia="SimSun" w:hAnsi="SimSun"/>
-                <w:sz w:val="18"/>
+              <w:spacing w:line="300" w:lineRule="auto"/>
+              <w:ind w:firstLine="482"/>
+            </w:pPr>
+            <w:r>
+              <w:rPr>
+                <w:rFonts w:hint="eastAsia" w:ascii="Times New Roman" w:hAnsi="Times New Roman" w:eastAsia="宋体"/>
+                <w:sz w:val="24"/>
                 <w:b/>
               </w:rPr>
               <w:t xml:space="preserve">事故响应：</w:t>
@@ -1687,78 +1658,143 @@
           </w:p>
           <w:p>
             <w:pPr>
-              <w:jc w:val="left"/>
-              <w:spacing w:line="300" w:lineRule="auto"/>
-            </w:pPr>
-            <w:r>
-              <w:rPr>
-                <w:rFonts w:ascii="SimSun" w:eastAsia="SimSun" w:hAnsi="SimSun"/>
-                <w:sz w:val="18"/>
+              <w:spacing w:line="300" w:lineRule="auto"/>
+            </w:pPr>
+            <w:r>
+              <w:rPr>
+                <w:rFonts w:hint="eastAsia" w:ascii="Times New Roman" w:hAnsi="Times New Roman" w:eastAsia="宋体"/>
+                <w:sz w:val="24"/>
+              </w:rPr>
+              <w:t xml:space="preserve"> </w:t>
+            </w:r>
+            <w:r>
+              <w:rPr>
+                <w:rFonts w:hint="eastAsia" w:ascii="Times New Roman" w:hAnsi="Times New Roman" w:eastAsia="宋体"/>
+                <w:sz w:val="24"/>
+              </w:rPr>
+              <w:t xml:space="preserve">       </w:t>
+            </w:r>
+            <w:r>
+              <w:rPr>
+                <w:rFonts w:hint="eastAsia" w:ascii="Times New Roman" w:hAnsi="Times New Roman" w:eastAsia="宋体"/>
+                <w:sz w:val="24"/>
               </w:rPr>
               <w:t xml:space="preserve">吸入：一旦吸入，如有不适，就医。</w:t>
             </w:r>
           </w:p>
           <w:p>
             <w:pPr>
-              <w:jc w:val="left"/>
-              <w:spacing w:line="300" w:lineRule="auto"/>
-            </w:pPr>
-            <w:r>
-              <w:rPr>
-                <w:rFonts w:ascii="SimSun" w:eastAsia="SimSun" w:hAnsi="SimSun"/>
-                <w:sz w:val="18"/>
+              <w:spacing w:line="300" w:lineRule="auto"/>
+            </w:pPr>
+            <w:r>
+              <w:rPr>
+                <w:rFonts w:hint="eastAsia" w:ascii="Times New Roman" w:hAnsi="Times New Roman" w:eastAsia="宋体"/>
+                <w:sz w:val="24"/>
+              </w:rPr>
+              <w:t xml:space="preserve"> </w:t>
+            </w:r>
+            <w:r>
+              <w:rPr>
+                <w:rFonts w:hint="eastAsia" w:ascii="Times New Roman" w:hAnsi="Times New Roman" w:eastAsia="宋体"/>
+                <w:sz w:val="24"/>
+              </w:rPr>
+              <w:t xml:space="preserve">       </w:t>
+            </w:r>
+            <w:r>
+              <w:rPr>
+                <w:rFonts w:hint="eastAsia" w:ascii="Times New Roman" w:hAnsi="Times New Roman" w:eastAsia="宋体"/>
+                <w:sz w:val="24"/>
               </w:rPr>
               <w:t xml:space="preserve">眼睛、皮肤接触；使用肥皂、清水等清洗即可。如有不适感，就医。</w:t>
             </w:r>
           </w:p>
           <w:p>
             <w:pPr>
-              <w:jc w:val="left"/>
-              <w:spacing w:line="300" w:lineRule="auto"/>
-            </w:pPr>
-            <w:r>
-              <w:rPr>
-                <w:rFonts w:ascii="SimSun" w:eastAsia="SimSun" w:hAnsi="SimSun"/>
-                <w:sz w:val="18"/>
+              <w:spacing w:line="300" w:lineRule="auto"/>
+            </w:pPr>
+            <w:r>
+              <w:rPr>
+                <w:rFonts w:hint="eastAsia" w:ascii="Times New Roman" w:hAnsi="Times New Roman" w:eastAsia="宋体"/>
+                <w:sz w:val="24"/>
+              </w:rPr>
+              <w:t xml:space="preserve"> </w:t>
+            </w:r>
+            <w:r>
+              <w:rPr>
+                <w:rFonts w:hint="eastAsia" w:ascii="Times New Roman" w:hAnsi="Times New Roman" w:eastAsia="宋体"/>
+                <w:sz w:val="24"/>
+              </w:rPr>
+              <w:t xml:space="preserve">       </w:t>
+            </w:r>
+            <w:r>
+              <w:rPr>
+                <w:rFonts w:hint="eastAsia" w:ascii="Times New Roman" w:hAnsi="Times New Roman" w:eastAsia="宋体"/>
+                <w:sz w:val="24"/>
               </w:rPr>
               <w:t xml:space="preserve">食入：立即漱口，禁止催吐，立即就医诊治。</w:t>
             </w:r>
           </w:p>
           <w:p>
             <w:pPr>
-              <w:jc w:val="left"/>
-              <w:spacing w:line="300" w:lineRule="auto"/>
-            </w:pPr>
-            <w:r>
-              <w:rPr>
-                <w:rFonts w:ascii="SimSun" w:eastAsia="SimSun" w:hAnsi="SimSun"/>
-                <w:sz w:val="18"/>
+              <w:spacing w:line="300" w:lineRule="auto"/>
+            </w:pPr>
+            <w:r>
+              <w:rPr>
+                <w:rFonts w:hint="eastAsia" w:ascii="Times New Roman" w:hAnsi="Times New Roman" w:eastAsia="宋体"/>
+                <w:sz w:val="24"/>
+              </w:rPr>
+              <w:t xml:space="preserve"> </w:t>
+            </w:r>
+            <w:r>
+              <w:rPr>
+                <w:rFonts w:hint="eastAsia" w:ascii="Times New Roman" w:hAnsi="Times New Roman" w:eastAsia="宋体"/>
+                <w:sz w:val="24"/>
+              </w:rPr>
+              <w:t xml:space="preserve">       </w:t>
+            </w:r>
+            <w:r>
+              <w:rPr>
+                <w:rFonts w:hint="eastAsia" w:ascii="Times New Roman" w:hAnsi="Times New Roman" w:eastAsia="宋体"/>
+                <w:sz w:val="24"/>
               </w:rPr>
               <w:t xml:space="preserve">泄露：收集泄漏物。</w:t>
             </w:r>
           </w:p>
           <w:p>
             <w:pPr>
-              <w:jc w:val="left"/>
-              <w:spacing w:line="300" w:lineRule="auto"/>
-            </w:pPr>
-            <w:r>
-              <w:rPr>
-                <w:rFonts w:ascii="SimSun" w:eastAsia="SimSun" w:hAnsi="SimSun"/>
-                <w:sz w:val="18"/>
+              <w:spacing w:line="300" w:lineRule="auto"/>
+            </w:pPr>
+            <w:r>
+              <w:rPr>
+                <w:rFonts w:hint="eastAsia" w:ascii="Times New Roman" w:hAnsi="Times New Roman" w:eastAsia="宋体"/>
+                <w:sz w:val="24"/>
+              </w:rPr>
+              <w:t xml:space="preserve"> </w:t>
+            </w:r>
+            <w:r>
+              <w:rPr>
+                <w:rFonts w:hint="eastAsia" w:ascii="Times New Roman" w:hAnsi="Times New Roman" w:eastAsia="宋体"/>
+                <w:sz w:val="24"/>
+              </w:rPr>
+              <w:t xml:space="preserve">       </w:t>
+            </w:r>
+            <w:r>
+              <w:rPr>
+                <w:rFonts w:hint="eastAsia" w:ascii="Times New Roman" w:hAnsi="Times New Roman" w:eastAsia="宋体"/>
+                <w:sz w:val="24"/>
               </w:rPr>
               <w:t xml:space="preserve">灭火：火灾时，使用干粉、泡沫、二氧化碳灭火。</w:t>
             </w:r>
           </w:p>
           <w:p>
             <w:pPr>
-              <w:jc w:val="left"/>
-              <w:spacing w:line="300" w:lineRule="auto"/>
-            </w:pPr>
-            <w:r>
-              <w:rPr>
-                <w:rFonts w:ascii="SimSun" w:eastAsia="SimSun" w:hAnsi="SimSun"/>
-                <w:sz w:val="18"/>
+              <w:spacing w:line="300" w:lineRule="auto"/>
+              <w:ind w:firstLine="482"/>
+            </w:pPr>
+            <w:r>
+              <w:rPr>
+                <w:rFonts w:hint="eastAsia" w:ascii="Times New Roman" w:hAnsi="Times New Roman" w:eastAsia="宋体"/>
+                <w:sz w:val="24"/>
                 <w:b/>
               </w:rPr>
               <w:t xml:space="preserve">安全存储：</w:t>
@@ -1766,26 +1802,53 @@
           </w:p>
           <w:p>
             <w:pPr>
-              <w:jc w:val="left"/>
-              <w:spacing w:line="300" w:lineRule="auto"/>
-            </w:pPr>
-            <w:r>
-              <w:rPr>
-                <w:rFonts w:ascii="SimSun" w:eastAsia="SimSun" w:hAnsi="SimSun"/>
-                <w:sz w:val="18"/>
-              </w:rPr>
-              <w:t xml:space="preserve">请置于避光、阴凉干燥处存放，存储温度应保持在5-35℃，避免霜冻，保持产品包装完整。每次取用之后立即密封，打开包装后尽快使用完毕。</w:t>
-            </w:r>
-          </w:p>
-          <w:p>
-            <w:pPr>
-              <w:jc w:val="left"/>
-              <w:spacing w:line="300" w:lineRule="auto"/>
-            </w:pPr>
-            <w:r>
-              <w:rPr>
-                <w:rFonts w:ascii="SimSun" w:eastAsia="SimSun" w:hAnsi="SimSun"/>
-                <w:sz w:val="18"/>
+              <w:spacing w:line="300" w:lineRule="auto"/>
+              <w:ind w:left="1199" w:hanging="720"/>
+            </w:pPr>
+            <w:r>
+              <w:rPr>
+                <w:rFonts w:hint="eastAsia" w:ascii="Times New Roman" w:hAnsi="Times New Roman" w:eastAsia="宋体"/>
+                <w:sz w:val="24"/>
+              </w:rPr>
+              <w:t xml:space="preserve"> </w:t>
+            </w:r>
+            <w:r>
+              <w:rPr>
+                <w:rFonts w:hint="eastAsia" w:ascii="Times New Roman" w:hAnsi="Times New Roman" w:eastAsia="宋体"/>
+                <w:sz w:val="24"/>
+              </w:rPr>
+              <w:t xml:space="preserve">   </w:t>
+            </w:r>
+            <w:r>
+              <w:rPr>
+                <w:rFonts w:hint="eastAsia" w:ascii="Times New Roman" w:hAnsi="Times New Roman" w:eastAsia="宋体"/>
+                <w:sz w:val="24"/>
+              </w:rPr>
+              <w:t xml:space="preserve">请置于避光、阴凉干燥处存放，存储温度应保持在5-35℃，避免霜冻，保持产品</w:t>
+            </w:r>
+          </w:p>
+          <w:p>
+            <w:pPr>
+              <w:spacing w:line="300" w:lineRule="auto"/>
+              <w:ind w:left="1198" w:hanging="240"/>
+            </w:pPr>
+            <w:r>
+              <w:rPr>
+                <w:rFonts w:hint="eastAsia" w:ascii="Times New Roman" w:hAnsi="Times New Roman" w:eastAsia="宋体"/>
+                <w:sz w:val="24"/>
+              </w:rPr>
+              <w:t xml:space="preserve">装完整。每次取用之后立即密封，打开包装后尽快使用完毕。</w:t>
+            </w:r>
+          </w:p>
+          <w:p>
+            <w:pPr>
+              <w:spacing w:line="300" w:lineRule="auto"/>
+              <w:ind w:firstLine="482"/>
+            </w:pPr>
+            <w:r>
+              <w:rPr>
+                <w:rFonts w:hint="eastAsia" w:ascii="Times New Roman" w:hAnsi="Times New Roman" w:eastAsia="宋体"/>
+                <w:sz w:val="24"/>
                 <w:b/>
               </w:rPr>
               <w:t xml:space="preserve">废弃处置：</w:t>
@@ -1793,57 +1856,90 @@
           </w:p>
           <w:p>
             <w:pPr>
-              <w:jc w:val="left"/>
-              <w:spacing w:line="300" w:lineRule="auto"/>
-            </w:pPr>
-            <w:r>
-              <w:rPr>
-                <w:rFonts w:ascii="SimSun" w:eastAsia="SimSun" w:hAnsi="SimSun"/>
-                <w:sz w:val="18"/>
+              <w:spacing w:line="300" w:lineRule="auto"/>
+              <w:ind w:left="959" w:hanging="480"/>
+            </w:pPr>
+            <w:r>
+              <w:rPr>
+                <w:rFonts w:hint="eastAsia" w:ascii="Times New Roman" w:hAnsi="Times New Roman" w:eastAsia="宋体"/>
+                <w:sz w:val="24"/>
+              </w:rPr>
+              <w:t xml:space="preserve"> </w:t>
+            </w:r>
+            <w:r>
+              <w:rPr>
+                <w:rFonts w:hint="eastAsia" w:ascii="Times New Roman" w:hAnsi="Times New Roman" w:eastAsia="宋体"/>
+                <w:sz w:val="24"/>
+              </w:rPr>
+              <w:t xml:space="preserve">   </w:t>
+            </w:r>
+            <w:r>
+              <w:rPr>
+                <w:rFonts w:hint="eastAsia" w:ascii="Times New Roman" w:hAnsi="Times New Roman" w:eastAsia="宋体"/>
+                <w:sz w:val="24"/>
               </w:rPr>
               <w:t xml:space="preserve">使用后的空桶未经无害化处理前，不得存储食物及其他物品，以免对人体、环境造成危害；包装物的回收、利用、处置应符合国家及当地相关法律、法规规定，因包装物处置不当造成的危害及损失，由处置方承担。</w:t>
             </w:r>
           </w:p>
           <w:p>
             <w:pPr>
-              <w:jc w:val="left"/>
-              <w:spacing w:line="300" w:lineRule="auto"/>
-            </w:pPr>
-            <w:r>
-              <w:rPr>
-                <w:rFonts w:ascii="SimSun" w:eastAsia="SimSun" w:hAnsi="SimSun"/>
-                <w:sz w:val="18"/>
-                <w:b/>
-              </w:rPr>
-              <w:t xml:space="preserve">物理化学危险：对水体、土壤可造成一定的污染。</w:t>
-            </w:r>
-          </w:p>
-          <w:p>
-            <w:pPr>
-              <w:jc w:val="left"/>
-              <w:spacing w:line="300" w:lineRule="auto"/>
-            </w:pPr>
-            <w:r>
-              <w:rPr>
-                <w:rFonts w:ascii="SimSun" w:eastAsia="SimSun" w:hAnsi="SimSun"/>
-                <w:sz w:val="18"/>
-                <w:b/>
-              </w:rPr>
-              <w:t xml:space="preserve">健康危害：无</w:t>
-            </w:r>
-          </w:p>
-          <w:p>
-            <w:pPr>
-              <w:jc w:val="left"/>
-              <w:spacing w:line="300" w:lineRule="auto"/>
-            </w:pPr>
-            <w:r>
-              <w:rPr>
-                <w:rFonts w:ascii="SimSun" w:eastAsia="SimSun" w:hAnsi="SimSun"/>
-                <w:sz w:val="18"/>
-                <w:b/>
-              </w:rPr>
-              <w:t xml:space="preserve">环境危害：无危险物质释放，防止进入下水道，以防聚合物沉积阻塞下水道。</w:t>
+              <w:spacing w:line="300" w:lineRule="auto"/>
+            </w:pPr>
+            <w:r>
+              <w:rPr>
+                <w:rFonts w:hint="eastAsia" w:ascii="Times New Roman" w:hAnsi="Times New Roman" w:eastAsia="宋体"/>
+                <w:sz w:val="24"/>
+                <w:b/>
+              </w:rPr>
+              <w:t xml:space="preserve">物理化学危险：</w:t>
+            </w:r>
+            <w:r>
+              <w:rPr>
+                <w:rFonts w:hint="eastAsia" w:ascii="Times New Roman" w:hAnsi="Times New Roman" w:eastAsia="宋体"/>
+                <w:sz w:val="24"/>
+              </w:rPr>
+              <w:t xml:space="preserve">对水体、土壤可造成一定的污染。</w:t>
+            </w:r>
+          </w:p>
+          <w:p>
+            <w:pPr>
+              <w:spacing w:line="300" w:lineRule="auto"/>
+            </w:pPr>
+            <w:r>
+              <w:rPr>
+                <w:rFonts w:hint="eastAsia" w:ascii="Times New Roman" w:hAnsi="Times New Roman" w:eastAsia="宋体"/>
+                <w:sz w:val="24"/>
+                <w:b/>
+              </w:rPr>
+              <w:t xml:space="preserve">健康危害：</w:t>
+            </w:r>
+            <w:r>
+              <w:rPr>
+                <w:rFonts w:hint="eastAsia" w:ascii="Times New Roman" w:hAnsi="Times New Roman" w:eastAsia="宋体"/>
+                <w:sz w:val="24"/>
+              </w:rPr>
+              <w:t xml:space="preserve">无</w:t>
+            </w:r>
+          </w:p>
+          <w:p>
+            <w:pPr>
+              <w:jc w:val="left"/>
+              <w:spacing w:line="300" w:lineRule="auto"/>
+            </w:pPr>
+            <w:r>
+              <w:rPr>
+                <w:rFonts w:hint="eastAsia" w:ascii="Times New Roman" w:hAnsi="Times New Roman" w:eastAsia="宋体"/>
+                <w:sz w:val="24"/>
+                <w:b/>
+              </w:rPr>
+              <w:t xml:space="preserve">环境危害：</w:t>
+            </w:r>
+            <w:r>
+              <w:rPr>
+                <w:rFonts w:hint="eastAsia" w:ascii="Times New Roman" w:hAnsi="Times New Roman" w:eastAsia="宋体"/>
+                <w:sz w:val="24"/>
+              </w:rPr>
+              <w:t xml:space="preserve">无危险物质释放，防止进入下水道，以防聚合物沉积阻塞下水道。</w:t>
             </w:r>
           </w:p>
         </w:tc>
@@ -1997,9 +2093,6 @@
                 <w:ilvl w:val="1"/>
                 <w:numId w:val="1"/>
               </w:numPr>
-              <w:tabs>
-                <w:tab w:val="clear" w:pos="540"/>
-              </w:tabs>
               <w:kinsoku/>
               <w:wordWrap/>
               <w:overflowPunct/>
@@ -2120,9 +2213,6 @@
                 <w:ilvl w:val="1"/>
                 <w:numId w:val="1"/>
               </w:numPr>
-              <w:tabs>
-                <w:tab w:val="clear" w:pos="540"/>
-              </w:tabs>
               <w:kinsoku/>
               <w:wordWrap/>
               <w:overflowPunct/>
@@ -3732,7 +3822,7 @@
                 <w:sz w:val="24"/>
                 <w:szCs w:val="24"/>
               </w:rPr>
-              <w:t>立即用肥皂和大量的水冲洗。若发生皮肤反应，就医</w:t>
+              <w:t>立即用肥皂和大量的水冲洗。若发生皮肤反应，就医。</w:t>
             </w:r>
           </w:p>
         </w:tc>
@@ -4091,7 +4181,7 @@
                 <w:sz w:val="24"/>
                 <w:szCs w:val="24"/>
               </w:rPr>
-              <w:t>二氧化碳（CO2），泡沫，灭火粉末，大火时应用喷洒水</w:t>
+              <w:t>二氧化碳（CO2），泡沫，灭火粉末，大火时应用喷洒水。</w:t>
             </w:r>
             <w:r>
               <w:rPr>
@@ -4252,9 +4342,6 @@
               <w:keepLines w:val="0"/>
               <w:pageBreakBefore w:val="0"/>
               <w:widowControl w:val="0"/>
-              <w:tabs>
-                <w:tab w:val="left" w:pos="-108"/>
-              </w:tabs>
               <w:kinsoku/>
               <w:wordWrap/>
               <w:overflowPunct/>
@@ -4550,9 +4637,6 @@
               <w:keepLines w:val="0"/>
               <w:pageBreakBefore w:val="0"/>
               <w:widowControl w:val="0"/>
-              <w:tabs>
-                <w:tab w:val="left" w:pos="-108"/>
-              </w:tabs>
               <w:kinsoku/>
               <w:wordWrap/>
               <w:overflowPunct/>
@@ -5225,9 +5309,6 @@
                 <w:ilvl w:val="1"/>
                 <w:numId w:val="2"/>
               </w:numPr>
-              <w:tabs>
-                <w:tab w:val="clear" w:pos="540"/>
-              </w:tabs>
               <w:kinsoku/>
               <w:wordWrap/>
               <w:overflowPunct/>
@@ -5301,7 +5382,7 @@
               <w:br/>
               <w:t>远离食物、饮料和烟草。休息以前和工作结束时洗手。将工作服单独存放。</w:t>
               <w:br/>
-              <w:t>更换被污染或浸湿的衣物</w:t>
+              <w:t>更换被污染或浸湿的衣物。</w:t>
             </w:r>
             <w:r>
               <w:rPr>
@@ -5361,9 +5442,6 @@
                 <w:ilvl w:val="1"/>
                 <w:numId w:val="2"/>
               </w:numPr>
-              <w:tabs>
-                <w:tab w:val="clear" w:pos="540"/>
-              </w:tabs>
               <w:kinsoku/>
               <w:wordWrap/>
               <w:overflowPunct/>
@@ -5813,9 +5891,6 @@
               <w:keepLines w:val="0"/>
               <w:pageBreakBefore w:val="0"/>
               <w:widowControl w:val="0"/>
-              <w:tabs>
-                <w:tab w:val="left" w:pos="3451"/>
-              </w:tabs>
               <w:kinsoku/>
               <w:wordWrap/>
               <w:overflowPunct/>
@@ -5845,7 +5920,6 @@
                 <w:b/>
                 <w:sz w:val="24"/>
               </w:rPr>
-              <w:tab/>
             </w:r>
             <w:r>
               <w:rPr>
@@ -5876,9 +5950,6 @@
               <w:keepLines w:val="0"/>
               <w:pageBreakBefore w:val="0"/>
               <w:widowControl w:val="0"/>
-              <w:tabs>
-                <w:tab w:val="left" w:pos="3451"/>
-              </w:tabs>
               <w:kinsoku/>
               <w:wordWrap/>
               <w:overflowPunct/>
@@ -7355,9 +7426,6 @@
               <w:keepLines w:val="0"/>
               <w:pageBreakBefore w:val="0"/>
               <w:widowControl w:val="0"/>
-              <w:tabs>
-                <w:tab w:val="left" w:pos="3960"/>
-              </w:tabs>
               <w:kinsoku/>
               <w:wordWrap/>
               <w:overflowPunct/>
@@ -9420,9 +9488,6 @@
                 <w:ilvl w:val="0"/>
                 <w:numId w:val="0"/>
               </w:numPr>
-              <w:tabs>
-                <w:tab w:val="left" w:pos="601"/>
-              </w:tabs>
               <w:kinsoku/>
               <w:wordWrap/>
               <w:overflowPunct/>
@@ -9558,9 +9623,6 @@
                 <w:ilvl w:val="0"/>
                 <w:numId w:val="0"/>
               </w:numPr>
-              <w:tabs>
-                <w:tab w:val="left" w:pos="601"/>
-              </w:tabs>
               <w:kinsoku/>
               <w:wordWrap/>
               <w:overflowPunct/>
@@ -9698,9 +9760,6 @@
                 <w:ilvl w:val="0"/>
                 <w:numId w:val="0"/>
               </w:numPr>
-              <w:tabs>
-                <w:tab w:val="left" w:pos="601"/>
-              </w:tabs>
               <w:kinsoku/>
               <w:wordWrap/>
               <w:overflowPunct/>
@@ -9916,21 +9975,22 @@
           <w:tcPr>
             <w:tcW w:w="9781" w:type="dxa"/>
             <w:gridSpan w:val="4"/>
+            <w:vAlign w:val="center"/>
             <w:tcBorders>
               <w:top w:val="dotted" w:color="auto" w:sz="4" w:space="0"/>
               <w:bottom w:val="dotted" w:color="auto" w:sz="4" w:space="0"/>
-            </w:tcBorders>
-            <w:vAlign w:val="center"/>
-          </w:tcPr>
-          <w:p>
-            <w:pPr>
-              <w:jc w:val="left"/>
-              <w:spacing w:line="300" w:lineRule="auto"/>
-            </w:pPr>
-            <w:r>
-              <w:rPr>
-                <w:rFonts w:ascii="SimSun" w:eastAsia="SimSun" w:hAnsi="SimSun"/>
-                <w:sz w:val="18"/>
+              <w:right w:val="dotted" w:color="auto" w:sz="4" w:space="0"/>
+            </w:tcBorders>
+          </w:tcPr>
+          <w:p>
+            <w:pPr>
+              <w:jc w:val="left"/>
+              <w:spacing w:line="300" w:lineRule="auto"/>
+            </w:pPr>
+            <w:r>
+              <w:rPr>
+                <w:rFonts w:hint="eastAsia" w:ascii="宋体" w:hAnsi="宋体" w:eastAsia="宋体"/>
+                <w:sz w:val="24"/>
               </w:rPr>
               <w:t xml:space="preserve">该产品无可用的毒理学研究。</w:t>
             </w:r>
@@ -9960,23 +10020,24 @@
         <w:tc>
           <w:tcPr>
             <w:tcW w:w="9781" w:type="dxa"/>
+            <w:gridSpan w:val="4"/>
+            <w:vAlign w:val="center"/>
             <w:tcBorders>
               <w:top w:val="dotted" w:color="auto" w:sz="4" w:space="0"/>
               <w:bottom w:val="dotted" w:color="auto" w:sz="4" w:space="0"/>
               <w:right w:val="dotted" w:color="auto" w:sz="4" w:space="0"/>
             </w:tcBorders>
-            <w:vAlign w:val="center"/>
-            <w:gridSpan w:val="4"/>
-          </w:tcPr>
-          <w:p>
-            <w:pPr>
-              <w:jc w:val="left"/>
-              <w:spacing w:line="300" w:lineRule="auto"/>
-            </w:pPr>
-            <w:r>
-              <w:rPr>
-                <w:rFonts w:ascii="SimSun" w:eastAsia="SimSun" w:hAnsi="SimSun"/>
-                <w:sz w:val="18"/>
+          </w:tcPr>
+          <w:p>
+            <w:pPr>
+              <w:jc w:val="left"/>
+              <w:spacing w:line="300" w:lineRule="auto"/>
+              <w:ind w:left="34"/>
+            </w:pPr>
+            <w:r>
+              <w:rPr>
+                <w:rFonts w:hint="eastAsia" w:ascii="宋体" w:hAnsi="宋体" w:eastAsia="宋体"/>
+                <w:sz w:val="24"/>
               </w:rPr>
               <w:t xml:space="preserve">下面是这些成分的毒理学数据。</w:t>
             </w:r>
@@ -10006,46 +10067,198 @@
         <w:tc>
           <w:tcPr>
             <w:tcW w:w="9781" w:type="dxa"/>
+            <w:gridSpan w:val="4"/>
+            <w:vAlign w:val="center"/>
             <w:tcBorders>
               <w:top w:val="dotted" w:color="auto" w:sz="4" w:space="0"/>
               <w:bottom w:val="dotted" w:color="auto" w:sz="4" w:space="0"/>
               <w:right w:val="dotted" w:color="auto" w:sz="4" w:space="0"/>
             </w:tcBorders>
-            <w:vAlign w:val="center"/>
-            <w:gridSpan w:val="4"/>
-          </w:tcPr>
-          <w:p>
-            <w:pPr>
-              <w:keepNext w:val="0"/>
-              <w:keepLines w:val="0"/>
-              <w:pageBreakBefore w:val="0"/>
-              <w:widowControl w:val="0"/>
-              <w:numPr>
-                <w:ilvl w:val="1"/>
-                <w:numId w:val="0"/>
-              </w:numPr>
-              <w:kinsoku/>
-              <w:wordWrap/>
-              <w:overflowPunct/>
-              <w:topLinePunct w:val="0"/>
-              <w:autoSpaceDE/>
-              <w:autoSpaceDN/>
-              <w:bidi w:val="0"/>
-              <w:adjustRightInd/>
-              <w:snapToGrid/>
-              <w:spacing w:line="300" w:lineRule="auto"/>
-              <w:ind w:left="599" w:leftChars="16" w:hanging="565" w:hangingChars="268"/>
-              <w:jc w:val="left"/>
-              <w:textAlignment w:val="auto"/>
-              <w:rPr>
-                <w:rFonts w:hint="default" w:ascii="Times New Roman" w:hAnsi="Times New Roman" w:eastAsia="宋体" w:cs="Times New Roman"/>
-                <w:b/>
-                <w:kern w:val="2"/>
-                <w:sz w:val="21"/>
-                <w:szCs w:val="21"/>
-                <w:lang w:val="en-US" w:eastAsia="zh-CN" w:bidi="ar-SA"/>
-              </w:rPr>
-            </w:pPr>
+          </w:tcPr>
+          <w:p>
+            <w:pPr>
+              <w:jc w:val="left"/>
+              <w:spacing w:line="300" w:lineRule="auto"/>
+              <w:ind w:left="34"/>
+            </w:pPr>
+            <w:r>
+              <w:rPr>
+                <w:rFonts w:hint="eastAsia" w:ascii="宋体" w:hAnsi="宋体" w:eastAsia="宋体"/>
+                <w:sz w:val="24"/>
+                <w:b/>
+              </w:rPr>
+              <w:t xml:space="preserve">羟基聚丙烯酸酯分散体：</w:t>
+            </w:r>
+            <w:r>
+              <w:rPr>
+                <w:rFonts w:hint="eastAsia" w:ascii="宋体" w:hAnsi="宋体" w:eastAsia="宋体"/>
+                <w:sz w:val="24"/>
+              </w:rPr>
+              <w:br w:type="textWrapping"/>
+            </w:r>
+            <w:r>
+              <w:rPr>
+                <w:rFonts w:hint="eastAsia" w:ascii="宋体" w:hAnsi="宋体" w:eastAsia="宋体"/>
+                <w:sz w:val="24"/>
+              </w:rPr>
+              <w:t xml:space="preserve">毒性：无资料；</w:t>
+            </w:r>
+          </w:p>
+          <w:p>
+            <w:pPr>
+              <w:jc w:val="left"/>
+              <w:spacing w:line="300" w:lineRule="auto"/>
+              <w:ind w:left="34"/>
+            </w:pPr>
+            <w:r>
+              <w:rPr>
+                <w:rFonts w:hint="eastAsia" w:ascii="宋体" w:hAnsi="宋体" w:eastAsia="宋体"/>
+                <w:sz w:val="24"/>
+              </w:rPr>
+              <w:t xml:space="preserve">刺激性：无资料</w:t>
+            </w:r>
+          </w:p>
+          <w:p>
+            <w:pPr>
+              <w:jc w:val="left"/>
+              <w:spacing w:line="300" w:lineRule="auto"/>
+              <w:ind w:left="34"/>
+            </w:pPr>
+            <w:r>
+              <w:rPr>
+                <w:rFonts w:hint="eastAsia" w:ascii="宋体" w:hAnsi="宋体" w:eastAsia="宋体"/>
+                <w:sz w:val="24"/>
+              </w:rPr>
+              <w:br w:type="textWrapping"/>
+            </w:r>
+            <w:r>
+              <w:rPr>
+                <w:rFonts w:hint="eastAsia" w:ascii="宋体" w:hAnsi="宋体" w:eastAsia="宋体"/>
+                <w:sz w:val="24"/>
+                <w:b/>
+              </w:rPr>
+              <w:t xml:space="preserve">丙二醇丁醚：</w:t>
+            </w:r>
+            <w:r>
+              <w:rPr>
+                <w:rFonts w:hint="eastAsia" w:ascii="宋体" w:hAnsi="宋体" w:eastAsia="宋体"/>
+                <w:sz w:val="24"/>
+              </w:rPr>
+              <w:br w:type="textWrapping"/>
+            </w:r>
+            <w:r>
+              <w:rPr>
+                <w:rFonts w:hint="eastAsia" w:ascii="宋体" w:hAnsi="宋体" w:eastAsia="宋体"/>
+                <w:sz w:val="24"/>
+              </w:rPr>
+              <w:t xml:space="preserve">毒性：经皮（鼠）LD50：＞2000 mg/kg</w:t>
+            </w:r>
+            <w:r>
+              <w:rPr>
+                <w:rFonts w:hint="eastAsia" w:ascii="宋体" w:hAnsi="宋体" w:eastAsia="宋体"/>
+                <w:sz w:val="24"/>
+              </w:rPr>
+              <w:br w:type="textWrapping"/>
+            </w:r>
+            <w:r>
+              <w:rPr>
+                <w:rFonts w:hint="eastAsia" w:ascii="宋体" w:hAnsi="宋体" w:eastAsia="宋体"/>
+                <w:sz w:val="24"/>
+              </w:rPr>
+              <w:t xml:space="preserve">      吸入（鼠）LD50：＞1997.718 mg/l/8hE</w:t>
+            </w:r>
+            <w:r>
+              <w:rPr>
+                <w:rFonts w:hint="eastAsia" w:ascii="宋体" w:hAnsi="宋体" w:eastAsia="宋体"/>
+                <w:sz w:val="24"/>
+              </w:rPr>
+              <w:br w:type="textWrapping"/>
+            </w:r>
+            <w:r>
+              <w:rPr>
+                <w:rFonts w:hint="eastAsia" w:ascii="宋体" w:hAnsi="宋体" w:eastAsia="宋体"/>
+                <w:sz w:val="24"/>
+              </w:rPr>
+              <w:t xml:space="preserve">      经口（鼠）LD50：＞2000 mg/kg</w:t>
+            </w:r>
+            <w:r>
+              <w:rPr>
+                <w:rFonts w:hint="eastAsia" w:ascii="宋体" w:hAnsi="宋体" w:eastAsia="宋体"/>
+                <w:sz w:val="24"/>
+              </w:rPr>
+              <w:br w:type="textWrapping"/>
+            </w:r>
+            <w:r>
+              <w:rPr>
+                <w:rFonts w:hint="eastAsia" w:ascii="宋体" w:hAnsi="宋体" w:eastAsia="宋体"/>
+                <w:sz w:val="24"/>
+              </w:rPr>
+              <w:t xml:space="preserve">刺激性：无资料</w:t>
+            </w:r>
+          </w:p>
+          <w:p>
+            <w:pPr>
+              <w:jc w:val="left"/>
+              <w:spacing w:line="300" w:lineRule="auto"/>
+              <w:ind w:left="34"/>
+            </w:pPr>
+            <w:r>
+              <w:rPr>
+                <w:rFonts w:hint="eastAsia" w:ascii="宋体" w:hAnsi="宋体" w:eastAsia="宋体"/>
+                <w:sz w:val="24"/>
+              </w:rPr>
+              <w:br w:type="textWrapping"/>
+            </w:r>
+            <w:r>
+              <w:rPr>
+                <w:rFonts w:hint="eastAsia" w:ascii="宋体" w:hAnsi="宋体" w:eastAsia="宋体"/>
+                <w:sz w:val="24"/>
+                <w:b/>
+              </w:rPr>
+              <w:t xml:space="preserve">二乙二醇丁醚：</w:t>
+            </w:r>
+            <w:r>
+              <w:rPr>
+                <w:rFonts w:hint="eastAsia" w:ascii="宋体" w:hAnsi="宋体" w:eastAsia="宋体"/>
+                <w:sz w:val="24"/>
+              </w:rPr>
+              <w:br w:type="textWrapping"/>
+            </w:r>
+            <w:r>
+              <w:rPr>
+                <w:rFonts w:hint="eastAsia" w:ascii="宋体" w:hAnsi="宋体" w:eastAsia="宋体"/>
+                <w:sz w:val="24"/>
+              </w:rPr>
+              <w:t xml:space="preserve">毒性：经皮（鼠）LD50：＞2000 mg/kg</w:t>
+            </w:r>
+            <w:r>
+              <w:rPr>
+                <w:rFonts w:hint="eastAsia" w:ascii="宋体" w:hAnsi="宋体" w:eastAsia="宋体"/>
+                <w:sz w:val="24"/>
+              </w:rPr>
+              <w:br w:type="textWrapping"/>
+            </w:r>
+            <w:r>
+              <w:rPr>
+                <w:rFonts w:hint="eastAsia" w:ascii="宋体" w:hAnsi="宋体" w:eastAsia="宋体"/>
+                <w:sz w:val="24"/>
+              </w:rPr>
+              <w:t xml:space="preserve">      经口（鼠）LD50：=4500 mg/kg</w:t>
+            </w:r>
+            <w:r>
+              <w:rPr>
+                <w:rFonts w:hint="eastAsia" w:ascii="宋体" w:hAnsi="宋体" w:eastAsia="宋体"/>
+                <w:sz w:val="24"/>
+              </w:rPr>
+              <w:br w:type="textWrapping"/>
+            </w:r>
+            <w:r>
+              <w:rPr>
+                <w:rFonts w:hint="eastAsia" w:ascii="宋体" w:hAnsi="宋体" w:eastAsia="宋体"/>
+                <w:sz w:val="24"/>
+              </w:rPr>
+              <w:t xml:space="preserve">刺激性：无资料</w:t>
+            </w:r>
           </w:p>
         </w:tc>
       </w:tr>
@@ -10182,9 +10395,6 @@
                 <w:ilvl w:val="1"/>
                 <w:numId w:val="0"/>
               </w:numPr>
-              <w:tabs>
-                <w:tab w:val="left" w:pos="601"/>
-              </w:tabs>
               <w:kinsoku/>
               <w:wordWrap/>
               <w:overflowPunct/>
@@ -10256,9 +10466,6 @@
                 <w:ilvl w:val="0"/>
                 <w:numId w:val="0"/>
               </w:numPr>
-              <w:tabs>
-                <w:tab w:val="left" w:pos="601"/>
-              </w:tabs>
               <w:kinsoku/>
               <w:wordWrap/>
               <w:overflowPunct/>
@@ -10335,9 +10542,6 @@
                 <w:ilvl w:val="1"/>
                 <w:numId w:val="0"/>
               </w:numPr>
-              <w:tabs>
-                <w:tab w:val="left" w:pos="601"/>
-              </w:tabs>
               <w:kinsoku/>
               <w:wordWrap/>
               <w:overflowPunct/>
@@ -10476,9 +10680,6 @@
                 <w:ilvl w:val="1"/>
                 <w:numId w:val="0"/>
               </w:numPr>
-              <w:tabs>
-                <w:tab w:val="left" w:pos="601"/>
-              </w:tabs>
               <w:kinsoku/>
               <w:wordWrap/>
               <w:overflowPunct/>
@@ -10836,7 +11037,7 @@
               <w:adjustRightInd/>
               <w:snapToGrid/>
               <w:spacing w:line="300" w:lineRule="auto"/>
-              <w:jc w:val="left"/>
+              <w:jc w:val="both"/>
               <w:textAlignment w:val="auto"/>
               <w:rPr>
                 <w:sz w:val="24"/>
@@ -11018,9 +11219,6 @@
                 <w:ilvl w:val="1"/>
                 <w:numId w:val="0"/>
               </w:numPr>
-              <w:tabs>
-                <w:tab w:val="left" w:pos="601"/>
-              </w:tabs>
               <w:kinsoku/>
               <w:wordWrap/>
               <w:overflowPunct/>
@@ -11157,9 +11355,6 @@
                 <w:ilvl w:val="1"/>
                 <w:numId w:val="0"/>
               </w:numPr>
-              <w:tabs>
-                <w:tab w:val="left" w:pos="601"/>
-              </w:tabs>
               <w:kinsoku/>
               <w:wordWrap/>
               <w:overflowPunct/>
@@ -11297,9 +11492,6 @@
                 <w:ilvl w:val="1"/>
                 <w:numId w:val="0"/>
               </w:numPr>
-              <w:tabs>
-                <w:tab w:val="left" w:pos="601"/>
-              </w:tabs>
               <w:kinsoku/>
               <w:wordWrap/>
               <w:overflowPunct/>
@@ -11437,9 +11629,6 @@
                 <w:ilvl w:val="1"/>
                 <w:numId w:val="0"/>
               </w:numPr>
-              <w:tabs>
-                <w:tab w:val="left" w:pos="601"/>
-              </w:tabs>
               <w:kinsoku/>
               <w:wordWrap/>
               <w:overflowPunct/>
@@ -12500,7 +12689,7 @@
               <w:sz w:val="18"/>
               <w:szCs w:val="18"/>
             </w:rPr>
-            <w:t>修订日期：2026/10/26   </w:t>
+            <w:t>修订日期：2026/10/27   </w:t>
           </w:r>
         </w:p>
       </w:tc>

</xml_diff>